<commit_message>
Template MULTI: ajout des champs interlocuteurs dans ANNEXE 1
Co-Authored-By: Claude Sonnet 4.6 <noreply@anthropic.com>
</commit_message>
<xml_diff>
--- a/public/templates/template_MULTI.docx
+++ b/public/templates/template_MULTI.docx
@@ -6877,7 +6877,7 @@
             </w:pPr>
             <w:permStart w:id="1401836604" w:edGrp="everyone"/>
             <w:r>
-              <w:t>A compléter par le Client</w:t>
+              <w:t>{contact_nom}</w:t>
             </w:r>
             <w:permEnd w:id="1401836604"/>
           </w:p>
@@ -6925,7 +6925,7 @@
             </w:pPr>
             <w:permStart w:id="2025603362" w:edGrp="everyone"/>
             <w:r>
-              <w:t>A compléter par le Client</w:t>
+              <w:t>{adresse_siege}</w:t>
             </w:r>
             <w:permEnd w:id="2025603362"/>
           </w:p>
@@ -6973,7 +6973,7 @@
             </w:pPr>
             <w:permStart w:id="220537050" w:edGrp="everyone"/>
             <w:r>
-              <w:t>A compléter par le Client</w:t>
+              <w:t>{contact_email}</w:t>
             </w:r>
             <w:permEnd w:id="220537050"/>
           </w:p>
@@ -7021,7 +7021,7 @@
             </w:pPr>
             <w:permStart w:id="649032582" w:edGrp="everyone"/>
             <w:r>
-              <w:t>A compléter par le Client</w:t>
+              <w:t>{contact_tel_fixe}</w:t>
             </w:r>
             <w:permEnd w:id="649032582"/>
           </w:p>
@@ -7069,7 +7069,7 @@
             </w:pPr>
             <w:permStart w:id="341462975" w:edGrp="everyone"/>
             <w:r>
-              <w:t>A compléter par le Client</w:t>
+              <w:t>{contact_tel_mobile}</w:t>
             </w:r>
             <w:permEnd w:id="341462975"/>
           </w:p>

</xml_diff>